<commit_message>
Update the planning documents' build status to 29 Oct
The roadmap phases, the 15 modules and the contract spreadsheet now
show what is built today (backend, content portal, staging, server
quizzes, progress, economy, leagues and Ask AI through the server),
with matching status colours and a change-log entry.

Co-Authored-By: Claude Opus 5.5 <noreply@anthropic.com>
</commit_message>
<xml_diff>
--- a/docs/planning/01_Product_Roadmap.docx
+++ b/docs/planning/01_Product_Roadmap.docx
@@ -1187,7 +1187,7 @@
         <w:pStyle w:val="Heading2"/>
       </w:pPr>
       <w:r>
-        <w:t>Build status (27 Oct 2026)</w:t>
+        <w:t>Build status (29 Oct 2026)</w:t>
       </w:r>
     </w:p>
     <w:tbl>
@@ -1297,7 +1297,7 @@
                 <w:b w:val="0"/>
                 <w:sz w:val="16"/>
               </w:rPr>
-              <w:t>Design system (Terracotta x Sand theme) and learner user flows exist in the app. Still needed: PRD sign-off, source policy, data dictionary, OpenAPI skeleton, backend stack choice.</w:t>
+              <w:t>Design system (Terracotta x Sand) and learner flows exist. Backend stack chosen (NestJS + Postgres), OpenAPI contract in backend/openapi.json. Still needed: PRD sign-off, source policy, data dictionary.</w:t>
             </w:r>
           </w:p>
         </w:tc>
@@ -1316,6 +1316,56 @@
                 <w:sz w:val="16"/>
               </w:rPr>
               <w:t>P1 Platform foundation</w:t>
+            </w:r>
+          </w:p>
+        </w:tc>
+        <w:tc>
+          <w:tcPr>
+            <w:tcW w:type="dxa" w:w="3408"/>
+            <w:shd w:val="clear" w:color="auto" w:fill="E2EFDA"/>
+            <w:vAlign w:val="top"/>
+          </w:tcPr>
+          <w:p>
+            <w:r>
+              <w:rPr>
+                <w:b/>
+                <w:sz w:val="16"/>
+              </w:rPr>
+              <w:t>Mostly done</w:t>
+            </w:r>
+          </w:p>
+        </w:tc>
+        <w:tc>
+          <w:tcPr>
+            <w:tcW w:type="dxa" w:w="3408"/>
+            <w:vAlign w:val="top"/>
+            <w:shd w:fill="F1F6FA"/>
+          </w:tcPr>
+          <w:p>
+            <w:r>
+              <w:rPr>
+                <w:b w:val="0"/>
+                <w:sz w:val="16"/>
+              </w:rPr>
+              <w:t>Learner and staff sign-in with roles, database migrations, CI on every push (backend, portal, app), a staging server with HTTPS and nightly database backups, standard API errors, and the app and portal shells. Still missing: staff management pages, analytics and crash reporting.</w:t>
+            </w:r>
+          </w:p>
+        </w:tc>
+      </w:tr>
+      <w:tr>
+        <w:tc>
+          <w:tcPr>
+            <w:tcW w:type="dxa" w:w="3408"/>
+            <w:vAlign w:val="top"/>
+            <w:shd w:fill="F1F6FA"/>
+          </w:tcPr>
+          <w:p>
+            <w:r>
+              <w:rPr>
+                <w:b w:val="0"/>
+                <w:sz w:val="16"/>
+              </w:rPr>
+              <w:t>P2 Content pipeline</w:t>
             </w:r>
           </w:p>
         </w:tc>
@@ -1347,57 +1397,7 @@
                 <w:b w:val="0"/>
                 <w:sz w:val="16"/>
               </w:rPr>
-              <w:t>Flutter app shell done. No auth, backend, environments, CI/CD or portal shell yet. Empty backend/ and cms/ folders created in the repo.</w:t>
-            </w:r>
-          </w:p>
-        </w:tc>
-      </w:tr>
-      <w:tr>
-        <w:tc>
-          <w:tcPr>
-            <w:tcW w:type="dxa" w:w="3408"/>
-            <w:vAlign w:val="top"/>
-            <w:shd w:fill="F1F6FA"/>
-          </w:tcPr>
-          <w:p>
-            <w:r>
-              <w:rPr>
-                <w:b w:val="0"/>
-                <w:sz w:val="16"/>
-              </w:rPr>
-              <w:t>P2 Content pipeline</w:t>
-            </w:r>
-          </w:p>
-        </w:tc>
-        <w:tc>
-          <w:tcPr>
-            <w:tcW w:type="dxa" w:w="3408"/>
-            <w:shd w:val="clear" w:color="auto" w:fill="EDEDED"/>
-            <w:vAlign w:val="top"/>
-          </w:tcPr>
-          <w:p>
-            <w:r>
-              <w:rPr>
-                <w:b/>
-                <w:sz w:val="16"/>
-              </w:rPr>
-              <w:t>Not started</w:t>
-            </w:r>
-          </w:p>
-        </w:tc>
-        <w:tc>
-          <w:tcPr>
-            <w:tcW w:type="dxa" w:w="3408"/>
-            <w:vAlign w:val="top"/>
-            <w:shd w:fill="F1F6FA"/>
-          </w:tcPr>
-          <w:p>
-            <w:r>
-              <w:rPr>
-                <w:b w:val="0"/>
-                <w:sz w:val="16"/>
-              </w:rPr>
-              <w:t>Not started. The 108 existing questions (with 5 translations) can be the first sample pack once the pipeline exists.</w:t>
+              <w:t>Content Management Portal: write, review and publish questions (draft → review → approved → published), fixed published versions, audit log. The 108 starter questions are imported. Still missing: taxonomy pages, sources and validity dates on the questions, CSV import.</w:t>
             </w:r>
           </w:p>
         </w:tc>
@@ -1447,7 +1447,7 @@
                 <w:b w:val="0"/>
                 <w:sz w:val="16"/>
               </w:rPr>
-              <w:t>Learner screens are built and tested offline (discovery, quiz, explanations, results, progress). Still needed: published content from the API, server scoring, bookmarks, mistake review, reports.</w:t>
+              <w:t>Quizzes run on the server: it picks the questions, keeps the answer keys and scores (including exam minus marks). Results, XP, stars, streak, coins, energy and settings are saved to the account. Still missing: bookmarks, mistake review, report-a-question.</w:t>
             </w:r>
           </w:p>
         </w:tc>
@@ -1497,7 +1497,7 @@
                 <w:b w:val="0"/>
                 <w:sz w:val="16"/>
               </w:rPr>
-              <w:t>Not started (38 automated tests exist for the offline app).</w:t>
+              <w:t>Not started. Automated tests exist: 37 unit and 63 API tests for the backend, 40 for the app.</w:t>
             </w:r>
           </w:p>
         </w:tc>
@@ -1547,7 +1547,7 @@
                 <w:b w:val="0"/>
                 <w:sz w:val="16"/>
               </w:rPr>
-              <w:t>Nothing yet.</w:t>
+              <w:t>Nothing yet. A staging server is running for testing (staging-api / staging-cms.deepwebstudio.dev).</w:t>
             </w:r>
           </w:p>
         </w:tc>
@@ -1572,7 +1572,7 @@
         <w:tc>
           <w:tcPr>
             <w:tcW w:type="dxa" w:w="3408"/>
-            <w:shd w:val="clear" w:color="auto" w:fill="E2EFDA"/>
+            <w:shd w:val="clear" w:color="auto" w:fill="FFF2CC"/>
             <w:vAlign w:val="top"/>
           </w:tcPr>
           <w:p>
@@ -1581,7 +1581,7 @@
                 <w:b/>
                 <w:sz w:val="16"/>
               </w:rPr>
-              <w:t>Done in app (offline)</w:t>
+              <w:t>Partly done</w:t>
             </w:r>
           </w:p>
         </w:tc>
@@ -1597,7 +1597,7 @@
                 <w:b w:val="0"/>
                 <w:sz w:val="16"/>
               </w:rPr>
-              <w:t>Ahead of plan on the device: streaks, daily challenge, leagues, 6 languages. Reminders and server-backed engagement not done.</w:t>
+              <w:t>Ahead of plan: streaks with freezes, Daily Docket, exam modes and real weekly leagues (on the server, topped up with practice players), 6 app languages. Still missing: push reminders, spaced repetition, language packs for quiz content.</w:t>
             </w:r>
           </w:p>
         </w:tc>
@@ -1647,7 +1647,7 @@
                 <w:b w:val="0"/>
                 <w:sz w:val="16"/>
               </w:rPr>
-              <w:t>Ask AI chat prototype and a demo premium paywall (no real payments).</w:t>
+              <w:t>Ask AI answers through the server with Azure OpenAI (gpt-5.4-mini), 5 free a day; no key in the app. Demo premium only (no real payments). Still missing: answers grounded in approved sources with citations.</w:t>
             </w:r>
           </w:p>
         </w:tc>
@@ -1655,7 +1655,7 @@
     </w:tbl>
     <w:p>
       <w:r>
-        <w:t>Built but not in this plan: a Legal Updates feed (10 curated landmark judgments and laws, with save) and a demo premium paywall. Payments are out of scope for the first release.</w:t>
+        <w:t>Built but not in this plan: a Legal Updates feed (10 curated landmark judgments and laws, with save) and a demo premium paywall (turned on by the app, testing only). Payments are out of scope for the first release.</w:t>
       </w:r>
     </w:p>
     <w:p>

</xml_diff>

<commit_message>
Add sources and dates to the starter questions; link them in the app
Each of the 108 starter questions now carries a researched source: the
official text (Gazette, India Code, Legislative Department, PIB or
Supreme Court), the citation, the date its answer became law, and a note
for the reviewer on how sure the research is. Two DPDP Act questions
only become valid on 13 May 2027, when those sections start.

The seed brings these in without skipping review: drafts get the source
where they have none, and questions published without review get a new
draft revision for a reviewer to approve. Nothing is published.

Learners see a "Read the official text" link under each explanation in
the quiz, the results review and the Review page.

Co-Authored-By: Claude Opus 5.5 <noreply@anthropic.com>
</commit_message>
<xml_diff>
--- a/docs/planning/01_Product_Roadmap.docx
+++ b/docs/planning/01_Product_Roadmap.docx
@@ -1397,7 +1397,7 @@
                 <w:b w:val="0"/>
                 <w:sz w:val="16"/>
               </w:rPr>
-              <w:t>Content Management Portal: write, review and publish questions (draft → review → approved → published), fixed published versions, audit log. The 108 starter questions are imported. Still missing: taxonomy pages, sources and validity dates on the questions, CSV import.</w:t>
+              <w:t>Content Management Portal: write, review and publish questions (draft → review → approved → published), fixed published versions, audit log. The 108 starter questions are imported and now carry researched sources, official links and validity dates, waiting for legal review. Still missing: taxonomy pages, staff account pages, CSV import, and a real reviewer signing off a sample pack.</w:t>
             </w:r>
           </w:p>
         </w:tc>
@@ -1422,7 +1422,7 @@
         <w:tc>
           <w:tcPr>
             <w:tcW w:type="dxa" w:w="3408"/>
-            <w:shd w:val="clear" w:color="auto" w:fill="FFF2CC"/>
+            <w:shd w:val="clear" w:color="auto" w:fill="E2EFDA"/>
             <w:vAlign w:val="top"/>
           </w:tcPr>
           <w:p>
@@ -1431,7 +1431,7 @@
                 <w:b/>
                 <w:sz w:val="16"/>
               </w:rPr>
-              <w:t>Partly done</w:t>
+              <w:t>Mostly done</w:t>
             </w:r>
           </w:p>
         </w:tc>
@@ -1447,7 +1447,7 @@
                 <w:b w:val="0"/>
                 <w:sz w:val="16"/>
               </w:rPr>
-              <w:t>Quizzes run on the server: it picks the questions, keeps the answer keys and scores (including exam minus marks). Results, XP, stars, streak, coins, energy and settings are saved to the account. Still missing: bookmarks, mistake review, report-a-question.</w:t>
+              <w:t>Quizzes run on the server: it picks the questions, keeps the answer keys and scores (including exam minus marks). Results, XP, stars, streak, coins, energy and settings are saved to the account. Saved questions, mistake review and report-a-question are built, and each explanation links to its official source. Still missing: QA sign-off of the learner journey on staging.</w:t>
             </w:r>
           </w:p>
         </w:tc>
@@ -1497,7 +1497,7 @@
                 <w:b w:val="0"/>
                 <w:sz w:val="16"/>
               </w:rPr>
-              <w:t>Not started. Automated tests exist: 37 unit and 63 API tests for the backend, 40 for the app.</w:t>
+              <w:t>Not started. Automated tests exist: 38 unit and 76 API tests for the backend, 41 for the app.</w:t>
             </w:r>
           </w:p>
         </w:tc>

</xml_diff>

<commit_message>
Import and export questions as CSV or Excel files
Editors check a file first (nothing is saved; each row's result names
the column and the reason), then import the valid new rows. Imports
only ever create drafts. Rows already in the bank are skipped, repeats
inside a file fail, and the same file cannot be imported twice. Each
import keeps a report.

The question list exports CSV or Excel in the same columns, so a file
can be edited and imported back. Planning documents mark M09 done.

Co-Authored-By: Claude Opus 5.5 <noreply@anthropic.com>
</commit_message>
<xml_diff>
--- a/docs/planning/01_Product_Roadmap.docx
+++ b/docs/planning/01_Product_Roadmap.docx
@@ -1397,7 +1397,7 @@
                 <w:b w:val="0"/>
                 <w:sz w:val="16"/>
               </w:rPr>
-              <w:t>Content Management Portal: write, review and publish questions (draft → review → approved → published), fixed published versions, audit log. The 108 starter questions are imported and now carry researched sources, official links and validity dates, waiting for legal review. Still missing: taxonomy pages, staff account pages, CSV import, and a real reviewer signing off a sample pack.</w:t>
+              <w:t>Content Management Portal: write, review and publish questions (draft → review → approved → published), fixed published versions, audit log, bulk submit / approve / publish, and CSV / Excel import (drafts only, with a test run and row-level errors) and export. The 108 starter questions carry researched sources, official links and validity dates, waiting for legal review. Still missing: taxonomy pages, staff account pages, and a real reviewer signing off a sample pack.</w:t>
             </w:r>
           </w:p>
         </w:tc>
@@ -1497,7 +1497,7 @@
                 <w:b w:val="0"/>
                 <w:sz w:val="16"/>
               </w:rPr>
-              <w:t>Not started. Automated tests exist: 38 unit and 76 API tests for the backend, 41 for the app.</w:t>
+              <w:t>Not started. Automated tests exist: 65 unit and 83 API tests for the backend, 41 for the app.</w:t>
             </w:r>
           </w:p>
         </w:tc>

</xml_diff>

<commit_message>
Manage subjects, topics and acts in the content portal
A new Topics page lists every subject with its topics, hidden ones
included, with question counts. Editors add, rename, reorder, show or
hide topics and acts; only admins change subjects. Slugs never change
and topics stay in their subject, because the app and learners'
progress refer to them; new subjects start hidden, and showing or
hiding asks first, saying what changes for learners.

The question list now names hidden topics too, and marks them.

Co-Authored-By: Claude Opus 5.5 <noreply@anthropic.com>
</commit_message>
<xml_diff>
--- a/docs/planning/01_Product_Roadmap.docx
+++ b/docs/planning/01_Product_Roadmap.docx
@@ -1397,7 +1397,7 @@
                 <w:b w:val="0"/>
                 <w:sz w:val="16"/>
               </w:rPr>
-              <w:t>Content Management Portal: write, review and publish questions (draft → review → approved → published), fixed published versions, audit log, bulk submit / approve / publish, and CSV / Excel import (drafts only, with a test run and row-level errors) and export. The 108 starter questions carry researched sources, official links and validity dates, waiting for legal review. Still missing: taxonomy pages, staff account pages, and a real reviewer signing off a sample pack.</w:t>
+              <w:t>Content Management Portal: write, review and publish questions (draft → review → approved → published), fixed published versions, audit log, bulk submit / approve / publish, CSV / Excel import (drafts only, with a test run and row-level errors) and export, and a Topics page for subjects, topics and acts. The 108 starter questions carry researched sources, official links and validity dates, waiting for legal review. Still missing: staff account pages, and a real reviewer signing off a sample pack.</w:t>
             </w:r>
           </w:p>
         </w:tc>
@@ -1497,7 +1497,7 @@
                 <w:b w:val="0"/>
                 <w:sz w:val="16"/>
               </w:rPr>
-              <w:t>Not started. Automated tests exist: 65 unit and 83 API tests for the backend, 41 for the app.</w:t>
+              <w:t>Not started. Automated tests exist: 65 unit and 88 API tests for the backend, 41 for the app.</w:t>
             </w:r>
           </w:p>
         </w:tc>

</xml_diff>

<commit_message>
Manage staff accounts with one-time setup links
Admins add staff from a new Staff page; each person gets a one-time
link (valid 7 days) to choose their own password, so nobody else ever
knows it. Admins change roles, disable or enable accounts (which signs
the person out at once) and make a new link for a forgotten password.
Nobody can remove their own admin role, and there is always an active
admin. Only a hash of each link is stored.

Co-Authored-By: Claude Opus 5.5 <noreply@anthropic.com>
</commit_message>
<xml_diff>
--- a/docs/planning/01_Product_Roadmap.docx
+++ b/docs/planning/01_Product_Roadmap.docx
@@ -1372,7 +1372,7 @@
         <w:tc>
           <w:tcPr>
             <w:tcW w:type="dxa" w:w="3408"/>
-            <w:shd w:val="clear" w:color="auto" w:fill="FFF2CC"/>
+            <w:shd w:val="clear" w:color="auto" w:fill="E2EFDA"/>
             <w:vAlign w:val="top"/>
           </w:tcPr>
           <w:p>
@@ -1381,7 +1381,7 @@
                 <w:b/>
                 <w:sz w:val="16"/>
               </w:rPr>
-              <w:t>Partly done</w:t>
+              <w:t>Mostly done</w:t>
             </w:r>
           </w:p>
         </w:tc>
@@ -1397,7 +1397,7 @@
                 <w:b w:val="0"/>
                 <w:sz w:val="16"/>
               </w:rPr>
-              <w:t>Content Management Portal: write, review and publish questions (draft → review → approved → published), fixed published versions, audit log, bulk submit / approve / publish, CSV / Excel import (drafts only, with a test run and row-level errors) and export, and a Topics page for subjects, topics and acts. The 108 starter questions carry researched sources, official links and validity dates, waiting for legal review. Still missing: staff account pages, and a real reviewer signing off a sample pack.</w:t>
+              <w:t>Content Management Portal: write, review and publish questions with fixed versions and an audit log; bulk submit / approve / publish; CSV / Excel import (drafts only, with a test run and row-level errors) and export; a Topics page for subjects, topics and acts; and Staff accounts with one-time setup links and role changes. The 108 starter questions carry researched sources, official links and validity dates. Still missing: a real legal reviewer signing off a sample pack on staging (the exit gate).</w:t>
             </w:r>
           </w:p>
         </w:tc>
@@ -1497,7 +1497,7 @@
                 <w:b w:val="0"/>
                 <w:sz w:val="16"/>
               </w:rPr>
-              <w:t>Not started. Automated tests exist: 65 unit and 88 API tests for the backend, 41 for the app.</w:t>
+              <w:t>Not started. Automated tests exist: 65 unit and 93 API tests for the backend, 41 for the app.</w:t>
             </w:r>
           </w:p>
         </w:tc>

</xml_diff>

<commit_message>
Let learners delete their own account in the app
Settings has a new Delete account row. It explains what goes, asks for
the password and, once the server has deleted the account, clears the
phone and starts again. The API's new route removes the account and the
personal data on it (quiz sessions, wallet, settings, saved questions,
league places, sign-in tokens, the learner's own audit entries). Reports
they sent stay for the editors without their name. Staff accounts are
removed by admins, not by their owners.

Both app stores require deletion from inside the app.

Co-Authored-By: Claude Sonnet 5.5 <noreply@anthropic.com>
</commit_message>
<xml_diff>
--- a/docs/planning/01_Product_Roadmap.docx
+++ b/docs/planning/01_Product_Roadmap.docx
@@ -1472,7 +1472,7 @@
         <w:tc>
           <w:tcPr>
             <w:tcW w:type="dxa" w:w="3408"/>
-            <w:shd w:val="clear" w:color="auto" w:fill="EDEDED"/>
+            <w:shd w:val="clear" w:color="auto" w:fill="FFF2CC"/>
             <w:vAlign w:val="top"/>
           </w:tcPr>
           <w:p>
@@ -1481,7 +1481,7 @@
                 <w:b/>
                 <w:sz w:val="16"/>
               </w:rPr>
-              <w:t>Not started</w:t>
+              <w:t>Partly done</w:t>
             </w:r>
           </w:p>
         </w:tc>
@@ -1497,7 +1497,7 @@
                 <w:b w:val="0"/>
                 <w:sz w:val="16"/>
               </w:rPr>
-              <w:t>Not started. Automated tests exist: 65 unit and 93 API tests for the backend, 41 for the app.</w:t>
+              <w:t>Started. Done: premium hidden for the beta (the app and the API), in-app account deletion. Decided: Sentry for crash reporting, our own usage events for analytics, citizens as the beta audience, production hosting later. Still to do: Sentry, usage events and a dashboard, minimum app version, translations of English-only screens, accessibility and dark-mode check, shared sign-in rate limit, key rotation, store preparation. Automated tests: 65 unit and 97 API tests for the backend, 42 for the app.</w:t>
             </w:r>
           </w:p>
         </w:tc>

</xml_diff>